<commit_message>
Assignment3: Design Document Part 1:System Overview updated by Tenay Giray.
</commit_message>
<xml_diff>
--- a/Assignment3/Desing Document.docx
+++ b/Assignment3/Desing Document.docx
@@ -635,7 +635,28 @@
           <w:sz w:val="24"/>
           <w:szCs w:val="24"/>
         </w:rPr>
-        <w:t>The user interacts with application through this layer. We decided to use Flutter to build our user interface. This layer handles UI, mode switching and local state management. It provides authentication services by using “Firebase Auth”.</w:t>
+        <w:t xml:space="preserve">The user interacts with application through this layer. We decided to use Flutter to build our user interface. This layer handles UI, mode switching and local state management. It </w:t>
+      </w:r>
+      <w:r>
+        <w:rPr>
+          <w:sz w:val="24"/>
+          <w:szCs w:val="24"/>
+        </w:rPr>
+        <w:t xml:space="preserve">triggers authentication and data </w:t>
+      </w:r>
+      <w:r>
+        <w:rPr>
+          <w:sz w:val="24"/>
+          <w:szCs w:val="24"/>
+        </w:rPr>
+        <w:t>processes</w:t>
+      </w:r>
+      <w:r>
+        <w:rPr>
+          <w:sz w:val="24"/>
+          <w:szCs w:val="24"/>
+        </w:rPr>
+        <w:t xml:space="preserve"> by communicating with the service layer.</w:t>
       </w:r>
     </w:p>
     <w:p>
@@ -798,23 +819,7 @@
           <w:sz w:val="24"/>
           <w:szCs w:val="24"/>
         </w:rPr>
-        <w:t xml:space="preserve">Service layer </w:t>
-      </w:r>
-      <w:proofErr w:type="gramStart"/>
-      <w:r>
-        <w:rPr>
-          <w:sz w:val="24"/>
-          <w:szCs w:val="24"/>
-        </w:rPr>
-        <w:t>process</w:t>
-      </w:r>
-      <w:proofErr w:type="gramEnd"/>
-      <w:r>
-        <w:rPr>
-          <w:sz w:val="24"/>
-          <w:szCs w:val="24"/>
-        </w:rPr>
-        <w:t xml:space="preserve"> the data fetched from </w:t>
+        <w:t xml:space="preserve">Service layer process the data fetched from </w:t>
       </w:r>
       <w:proofErr w:type="spellStart"/>
       <w:r>

</xml_diff>